<commit_message>
Tese v1.1: remove X espurio dos 75 DOIs (strip de hyperlinks externos)
O LibreOffice imprimia um "X" no fim de cada DOI hyperlinkado nas Referencias
(artefato de render, nao estava no texto). strip_crossref_hyperlinks.py agora
desembrulha tambem os <w:hyperlink r:id=> externos, preservando o texto do DOI
(inclusive os que terminam legitimamente em -X). PDF final: 0 DOI-X, 0 ".X".
</commit_message>
<xml_diff>
--- a/submission/TESE_CorePAM_v1.1_corrigida.docx
+++ b/submission/TESE_CorePAM_v1.1_corrigida.docx
@@ -31986,12 +31986,10 @@
       <w:r>
         <w:t xml:space="preserve"> </w:t>
       </w:r>
-      <w:hyperlink r:id="rId235">
-        <w:r>
-          <w:rPr/>
-          <w:t xml:space="preserve">https://doi.org/10.3322/caac.21660</w:t>
-        </w:r>
-      </w:hyperlink>
+      <w:r>
+        <w:rPr/>
+        <w:t xml:space="preserve">https://doi.org/10.3322/caac.21660</w:t>
+      </w:r>
     </w:p>
     <w:bookmarkEnd w:id="236"/>
     <w:bookmarkStart w:id="238" w:name="ref-bray2024"/>
@@ -32026,12 +32024,10 @@
       <w:r>
         <w:t xml:space="preserve"> </w:t>
       </w:r>
-      <w:hyperlink r:id="rId237">
-        <w:r>
-          <w:rPr/>
-          <w:t xml:space="preserve">https://doi.org/10.3322/caac.21834</w:t>
-        </w:r>
-      </w:hyperlink>
+      <w:r>
+        <w:rPr/>
+        <w:t xml:space="preserve">https://doi.org/10.3322/caac.21834</w:t>
+      </w:r>
     </w:p>
     <w:bookmarkEnd w:id="238"/>
     <w:bookmarkStart w:id="240" w:name="ref-peto2012"/>
@@ -32054,12 +32050,10 @@
       <w:r>
         <w:t xml:space="preserve"> </w:t>
       </w:r>
-      <w:hyperlink r:id="rId239">
-        <w:r>
-          <w:rPr/>
-          <w:t xml:space="preserve">https://doi.org/10.1016/S0140-6736(11)61625-5</w:t>
-        </w:r>
-      </w:hyperlink>
+      <w:r>
+        <w:rPr/>
+        <w:t xml:space="preserve">https://doi.org/10.1016/S0140-6736(11)61625-5</w:t>
+      </w:r>
     </w:p>
     <w:bookmarkEnd w:id="240"/>
     <w:bookmarkStart w:id="242" w:name="ref-ebctcg2011"/>
@@ -32082,12 +32076,10 @@
       <w:r>
         <w:t xml:space="preserve"> </w:t>
       </w:r>
-      <w:hyperlink r:id="rId241">
-        <w:r>
-          <w:rPr/>
-          <w:t xml:space="preserve">https://doi.org/10.1016/S0140-6736(11)60993-8</w:t>
-        </w:r>
-      </w:hyperlink>
+      <w:r>
+        <w:rPr/>
+        <w:t xml:space="preserve">https://doi.org/10.1016/S0140-6736(11)60993-8</w:t>
+      </w:r>
     </w:p>
     <w:bookmarkEnd w:id="242"/>
     <w:bookmarkStart w:id="243" w:name="ref-inca2023"/>
@@ -32147,12 +32139,10 @@
       <w:r>
         <w:t xml:space="preserve"> </w:t>
       </w:r>
-      <w:hyperlink r:id="rId244">
-        <w:r>
-          <w:rPr/>
-          <w:t xml:space="preserve">https://doi.org/10.1590/0102-311X00074817</w:t>
-        </w:r>
-      </w:hyperlink>
+      <w:r>
+        <w:rPr/>
+        <w:t xml:space="preserve">https://doi.org/10.1590/0102-311X00074817</w:t>
+      </w:r>
     </w:p>
     <w:bookmarkEnd w:id="245"/>
     <w:bookmarkStart w:id="247" w:name="ref-harbeck2019"/>
@@ -32175,12 +32165,10 @@
       <w:r>
         <w:t xml:space="preserve"> </w:t>
       </w:r>
-      <w:hyperlink r:id="rId246">
-        <w:r>
-          <w:rPr/>
-          <w:t xml:space="preserve">https://doi.org/10.1038/s41572-019-0111-2</w:t>
-        </w:r>
-      </w:hyperlink>
+      <w:r>
+        <w:rPr/>
+        <w:t xml:space="preserve">https://doi.org/10.1038/s41572-019-0111-2</w:t>
+      </w:r>
     </w:p>
     <w:bookmarkEnd w:id="247"/>
     <w:bookmarkStart w:id="249" w:name="ref-perou2000"/>
@@ -32203,12 +32191,10 @@
       <w:r>
         <w:t xml:space="preserve"> </w:t>
       </w:r>
-      <w:hyperlink r:id="rId248">
-        <w:r>
-          <w:rPr/>
-          <w:t xml:space="preserve">https://doi.org/10.1038/35021093</w:t>
-        </w:r>
-      </w:hyperlink>
+      <w:r>
+        <w:rPr/>
+        <w:t xml:space="preserve">https://doi.org/10.1038/35021093</w:t>
+      </w:r>
     </w:p>
     <w:bookmarkEnd w:id="249"/>
     <w:bookmarkStart w:id="251" w:name="ref-sorlie2001"/>
@@ -32231,12 +32217,10 @@
       <w:r>
         <w:t xml:space="preserve"> </w:t>
       </w:r>
-      <w:hyperlink r:id="rId250">
-        <w:r>
-          <w:rPr/>
-          <w:t xml:space="preserve">https://doi.org/10.1073/pnas.191367098</w:t>
-        </w:r>
-      </w:hyperlink>
+      <w:r>
+        <w:rPr/>
+        <w:t xml:space="preserve">https://doi.org/10.1073/pnas.191367098</w:t>
+      </w:r>
     </w:p>
     <w:bookmarkEnd w:id="251"/>
     <w:bookmarkStart w:id="253" w:name="ref-pratperou2011"/>
@@ -32259,12 +32243,10 @@
       <w:r>
         <w:t xml:space="preserve"> </w:t>
       </w:r>
-      <w:hyperlink r:id="rId252">
-        <w:r>
-          <w:rPr/>
-          <w:t xml:space="preserve">https://doi.org/10.1016/j.molonc.2010.11.003</w:t>
-        </w:r>
-      </w:hyperlink>
+      <w:r>
+        <w:rPr/>
+        <w:t xml:space="preserve">https://doi.org/10.1016/j.molonc.2010.11.003</w:t>
+      </w:r>
     </w:p>
     <w:bookmarkEnd w:id="253"/>
     <w:bookmarkStart w:id="255" w:name="ref-curtis2012"/>
@@ -32287,12 +32269,10 @@
       <w:r>
         <w:t xml:space="preserve"> </w:t>
       </w:r>
-      <w:hyperlink r:id="rId254">
-        <w:r>
-          <w:rPr/>
-          <w:t xml:space="preserve">https://doi.org/10.1038/nature10983</w:t>
-        </w:r>
-      </w:hyperlink>
+      <w:r>
+        <w:rPr/>
+        <w:t xml:space="preserve">https://doi.org/10.1038/nature10983</w:t>
+      </w:r>
     </w:p>
     <w:bookmarkEnd w:id="255"/>
     <w:bookmarkStart w:id="257" w:name="ref-pereira2016"/>
@@ -32315,12 +32295,10 @@
       <w:r>
         <w:t xml:space="preserve"> </w:t>
       </w:r>
-      <w:hyperlink r:id="rId256">
-        <w:r>
-          <w:rPr/>
-          <w:t xml:space="preserve">https://doi.org/10.1038/ncomms11479</w:t>
-        </w:r>
-      </w:hyperlink>
+      <w:r>
+        <w:rPr/>
+        <w:t xml:space="preserve">https://doi.org/10.1038/ncomms11479</w:t>
+      </w:r>
     </w:p>
     <w:bookmarkEnd w:id="257"/>
     <w:bookmarkStart w:id="259" w:name="ref-parker2009"/>
@@ -32343,12 +32321,10 @@
       <w:r>
         <w:t xml:space="preserve"> </w:t>
       </w:r>
-      <w:hyperlink r:id="rId258">
-        <w:r>
-          <w:rPr/>
-          <w:t xml:space="preserve">https://doi.org/10.1200/JCO.2008.18.1370</w:t>
-        </w:r>
-      </w:hyperlink>
+      <w:r>
+        <w:rPr/>
+        <w:t xml:space="preserve">https://doi.org/10.1200/JCO.2008.18.1370</w:t>
+      </w:r>
     </w:p>
     <w:bookmarkEnd w:id="259"/>
     <w:bookmarkStart w:id="261" w:name="ref-nielsen2010"/>
@@ -32383,12 +32359,10 @@
       <w:r>
         <w:t xml:space="preserve"> </w:t>
       </w:r>
-      <w:hyperlink r:id="rId260">
-        <w:r>
-          <w:rPr/>
-          <w:t xml:space="preserve">https://doi.org/10.1158/1078-0432.CCR-10-1282</w:t>
-        </w:r>
-      </w:hyperlink>
+      <w:r>
+        <w:rPr/>
+        <w:t xml:space="preserve">https://doi.org/10.1158/1078-0432.CCR-10-1282</w:t>
+      </w:r>
     </w:p>
     <w:bookmarkEnd w:id="261"/>
     <w:bookmarkStart w:id="263" w:name="ref-chia2012"/>
@@ -32411,12 +32385,10 @@
       <w:r>
         <w:t xml:space="preserve"> </w:t>
       </w:r>
-      <w:hyperlink r:id="rId262">
-        <w:r>
-          <w:rPr/>
-          <w:t xml:space="preserve">https://doi.org/10.1158/1078-0432.CCR-12-0286</w:t>
-        </w:r>
-      </w:hyperlink>
+      <w:r>
+        <w:rPr/>
+        <w:t xml:space="preserve">https://doi.org/10.1158/1078-0432.CCR-12-0286</w:t>
+      </w:r>
     </w:p>
     <w:bookmarkEnd w:id="263"/>
     <w:bookmarkStart w:id="265" w:name="ref-wallden2015"/>
@@ -32457,12 +32429,10 @@
       <w:r>
         <w:t xml:space="preserve"> </w:t>
       </w:r>
-      <w:hyperlink r:id="rId264">
-        <w:r>
-          <w:rPr/>
-          <w:t xml:space="preserve">https://doi.org/10.1186/s12920-015-0129-6</w:t>
-        </w:r>
-      </w:hyperlink>
+      <w:r>
+        <w:rPr/>
+        <w:t xml:space="preserve">https://doi.org/10.1186/s12920-015-0129-6</w:t>
+      </w:r>
     </w:p>
     <w:bookmarkEnd w:id="265"/>
     <w:bookmarkStart w:id="267" w:name="ref-dowsett2010"/>
@@ -32497,12 +32467,10 @@
       <w:r>
         <w:t xml:space="preserve"> </w:t>
       </w:r>
-      <w:hyperlink r:id="rId266">
-        <w:r>
-          <w:rPr/>
-          <w:t xml:space="preserve">https://doi.org/10.1200/JCO.2009.24.4798</w:t>
-        </w:r>
-      </w:hyperlink>
+      <w:r>
+        <w:rPr/>
+        <w:t xml:space="preserve">https://doi.org/10.1200/JCO.2009.24.4798</w:t>
+      </w:r>
     </w:p>
     <w:bookmarkEnd w:id="267"/>
     <w:bookmarkStart w:id="269" w:name="ref-gnant2014"/>
@@ -32549,12 +32517,10 @@
       <w:r>
         <w:t xml:space="preserve"> </w:t>
       </w:r>
-      <w:hyperlink r:id="rId268">
-        <w:r>
-          <w:rPr/>
-          <w:t xml:space="preserve">https://doi.org/10.1093/annonc/mdt494</w:t>
-        </w:r>
-      </w:hyperlink>
+      <w:r>
+        <w:rPr/>
+        <w:t xml:space="preserve">https://doi.org/10.1093/annonc/mdt494</w:t>
+      </w:r>
     </w:p>
     <w:bookmarkEnd w:id="269"/>
     <w:bookmarkStart w:id="271" w:name="ref-coates2015"/>
@@ -32667,12 +32633,10 @@
       <w:r>
         <w:t xml:space="preserve"> </w:t>
       </w:r>
-      <w:hyperlink r:id="rId270">
-        <w:r>
-          <w:rPr/>
-          <w:t xml:space="preserve">https://doi.org/10.1093/annonc/mdv221</w:t>
-        </w:r>
-      </w:hyperlink>
+      <w:r>
+        <w:rPr/>
+        <w:t xml:space="preserve">https://doi.org/10.1093/annonc/mdv221</w:t>
+      </w:r>
     </w:p>
     <w:bookmarkEnd w:id="271"/>
     <w:bookmarkStart w:id="273" w:name="ref-burstein2019"/>
@@ -32740,12 +32704,10 @@
       <w:r>
         <w:t xml:space="preserve"> </w:t>
       </w:r>
-      <w:hyperlink r:id="rId272">
-        <w:r>
-          <w:rPr/>
-          <w:t xml:space="preserve">https://doi.org/10.1093/annonc/mdz235</w:t>
-        </w:r>
-      </w:hyperlink>
+      <w:r>
+        <w:rPr/>
+        <w:t xml:space="preserve">https://doi.org/10.1093/annonc/mdz235</w:t>
+      </w:r>
     </w:p>
     <w:bookmarkEnd w:id="273"/>
     <w:bookmarkStart w:id="275" w:name="ref-andre2022"/>
@@ -32780,12 +32742,10 @@
       <w:r>
         <w:t xml:space="preserve"> </w:t>
       </w:r>
-      <w:hyperlink r:id="rId274">
-        <w:r>
-          <w:rPr/>
-          <w:t xml:space="preserve">https://doi.org/10.1200/JCO.22.00069</w:t>
-        </w:r>
-      </w:hyperlink>
+      <w:r>
+        <w:rPr/>
+        <w:t xml:space="preserve">https://doi.org/10.1200/JCO.22.00069</w:t>
+      </w:r>
     </w:p>
     <w:bookmarkEnd w:id="275"/>
     <w:bookmarkStart w:id="277" w:name="ref-paik2004"/>
@@ -32808,12 +32768,10 @@
       <w:r>
         <w:t xml:space="preserve"> </w:t>
       </w:r>
-      <w:hyperlink r:id="rId276">
-        <w:r>
-          <w:rPr/>
-          <w:t xml:space="preserve">https://doi.org/10.1056/NEJMoa041588</w:t>
-        </w:r>
-      </w:hyperlink>
+      <w:r>
+        <w:rPr/>
+        <w:t xml:space="preserve">https://doi.org/10.1056/NEJMoa041588</w:t>
+      </w:r>
     </w:p>
     <w:bookmarkEnd w:id="277"/>
     <w:bookmarkStart w:id="279" w:name="ref-sparano2018"/>
@@ -32836,12 +32794,10 @@
       <w:r>
         <w:t xml:space="preserve"> </w:t>
       </w:r>
-      <w:hyperlink r:id="rId278">
-        <w:r>
-          <w:rPr/>
-          <w:t xml:space="preserve">https://doi.org/10.1056/NEJMoa1804710</w:t>
-        </w:r>
-      </w:hyperlink>
+      <w:r>
+        <w:rPr/>
+        <w:t xml:space="preserve">https://doi.org/10.1056/NEJMoa1804710</w:t>
+      </w:r>
     </w:p>
     <w:bookmarkEnd w:id="279"/>
     <w:bookmarkStart w:id="281" w:name="ref-sparano2019"/>
@@ -32864,12 +32820,10 @@
       <w:r>
         <w:t xml:space="preserve"> </w:t>
       </w:r>
-      <w:hyperlink r:id="rId280">
-        <w:r>
-          <w:rPr/>
-          <w:t xml:space="preserve">https://doi.org/10.1056/NEJMoa1904819</w:t>
-        </w:r>
-      </w:hyperlink>
+      <w:r>
+        <w:rPr/>
+        <w:t xml:space="preserve">https://doi.org/10.1056/NEJMoa1904819</w:t>
+      </w:r>
     </w:p>
     <w:bookmarkEnd w:id="281"/>
     <w:bookmarkStart w:id="283" w:name="ref-kalinsky2021"/>
@@ -32892,12 +32846,10 @@
       <w:r>
         <w:t xml:space="preserve"> </w:t>
       </w:r>
-      <w:hyperlink r:id="rId282">
-        <w:r>
-          <w:rPr/>
-          <w:t xml:space="preserve">https://doi.org/10.1056/NEJMoa2108873</w:t>
-        </w:r>
-      </w:hyperlink>
+      <w:r>
+        <w:rPr/>
+        <w:t xml:space="preserve">https://doi.org/10.1056/NEJMoa2108873</w:t>
+      </w:r>
     </w:p>
     <w:bookmarkEnd w:id="283"/>
     <w:bookmarkStart w:id="285" w:name="ref-vantveer2002"/>
@@ -32920,12 +32872,10 @@
       <w:r>
         <w:t xml:space="preserve"> </w:t>
       </w:r>
-      <w:hyperlink r:id="rId284">
-        <w:r>
-          <w:rPr/>
-          <w:t xml:space="preserve">https://doi.org/10.1038/415530a</w:t>
-        </w:r>
-      </w:hyperlink>
+      <w:r>
+        <w:rPr/>
+        <w:t xml:space="preserve">https://doi.org/10.1038/415530a</w:t>
+      </w:r>
     </w:p>
     <w:bookmarkEnd w:id="285"/>
     <w:bookmarkStart w:id="287" w:name="ref-cardoso2016"/>
@@ -32948,12 +32898,10 @@
       <w:r>
         <w:t xml:space="preserve"> </w:t>
       </w:r>
-      <w:hyperlink r:id="rId286">
-        <w:r>
-          <w:rPr/>
-          <w:t xml:space="preserve">https://doi.org/10.1056/NEJMoa1602253</w:t>
-        </w:r>
-      </w:hyperlink>
+      <w:r>
+        <w:rPr/>
+        <w:t xml:space="preserve">https://doi.org/10.1056/NEJMoa1602253</w:t>
+      </w:r>
     </w:p>
     <w:bookmarkEnd w:id="287"/>
     <w:bookmarkStart w:id="289" w:name="ref-piccart2021"/>
@@ -32988,12 +32936,10 @@
       <w:r>
         <w:t xml:space="preserve"> </w:t>
       </w:r>
-      <w:hyperlink r:id="rId288">
-        <w:r>
-          <w:rPr/>
-          <w:t xml:space="preserve">https://doi.org/10.1016/S1470-2045(21)00007-3</w:t>
-        </w:r>
-      </w:hyperlink>
+      <w:r>
+        <w:rPr/>
+        <w:t xml:space="preserve">https://doi.org/10.1016/S1470-2045(21)00007-3</w:t>
+      </w:r>
     </w:p>
     <w:bookmarkEnd w:id="289"/>
     <w:bookmarkStart w:id="291" w:name="ref-filipits2011"/>
@@ -33034,12 +32980,10 @@
       <w:r>
         <w:t xml:space="preserve"> </w:t>
       </w:r>
-      <w:hyperlink r:id="rId290">
-        <w:r>
-          <w:rPr/>
-          <w:t xml:space="preserve">https://doi.org/10.1158/1078-0432.CCR-11-0926</w:t>
-        </w:r>
-      </w:hyperlink>
+      <w:r>
+        <w:rPr/>
+        <w:t xml:space="preserve">https://doi.org/10.1158/1078-0432.CCR-11-0926</w:t>
+      </w:r>
     </w:p>
     <w:bookmarkEnd w:id="291"/>
     <w:bookmarkStart w:id="293" w:name="ref-zhang2013"/>
@@ -33080,12 +33024,10 @@
       <w:r>
         <w:t xml:space="preserve"> </w:t>
       </w:r>
-      <w:hyperlink r:id="rId292">
-        <w:r>
-          <w:rPr/>
-          <w:t xml:space="preserve">https://doi.org/10.1158/1078-0432.CCR-13-0804</w:t>
-        </w:r>
-      </w:hyperlink>
+      <w:r>
+        <w:rPr/>
+        <w:t xml:space="preserve">https://doi.org/10.1158/1078-0432.CCR-13-0804</w:t>
+      </w:r>
     </w:p>
     <w:bookmarkEnd w:id="293"/>
     <w:bookmarkStart w:id="295" w:name="ref-sestak2018"/>
@@ -33108,12 +33050,10 @@
       <w:r>
         <w:t xml:space="preserve"> </w:t>
       </w:r>
-      <w:hyperlink r:id="rId294">
-        <w:r>
-          <w:rPr/>
-          <w:t xml:space="preserve">https://doi.org/10.1001/jamaoncol.2017.5524</w:t>
-        </w:r>
-      </w:hyperlink>
+      <w:r>
+        <w:rPr/>
+        <w:t xml:space="preserve">https://doi.org/10.1001/jamaoncol.2017.5524</w:t>
+      </w:r>
     </w:p>
     <w:bookmarkEnd w:id="295"/>
     <w:bookmarkStart w:id="297" w:name="ref-love2014"/>
@@ -33154,12 +33094,10 @@
       <w:r>
         <w:t xml:space="preserve"> </w:t>
       </w:r>
-      <w:hyperlink r:id="rId296">
-        <w:r>
-          <w:rPr/>
-          <w:t xml:space="preserve">https://doi.org/10.1186/s13059-014-0550-8</w:t>
-        </w:r>
-      </w:hyperlink>
+      <w:r>
+        <w:rPr/>
+        <w:t xml:space="preserve">https://doi.org/10.1186/s13059-014-0550-8</w:t>
+      </w:r>
     </w:p>
     <w:bookmarkEnd w:id="297"/>
     <w:bookmarkStart w:id="299" w:name="ref-ritchie2015"/>
@@ -33203,12 +33141,10 @@
       <w:r>
         <w:t xml:space="preserve"> </w:t>
       </w:r>
-      <w:hyperlink r:id="rId298">
-        <w:r>
-          <w:rPr/>
-          <w:t xml:space="preserve">https://doi.org/10.1093/nar/gkv007</w:t>
-        </w:r>
-      </w:hyperlink>
+      <w:r>
+        <w:rPr/>
+        <w:t xml:space="preserve">https://doi.org/10.1093/nar/gkv007</w:t>
+      </w:r>
     </w:p>
     <w:bookmarkEnd w:id="299"/>
     <w:bookmarkStart w:id="301" w:name="ref-maqc2010"/>
@@ -33279,12 +33215,10 @@
       <w:r>
         <w:t xml:space="preserve"> </w:t>
       </w:r>
-      <w:hyperlink r:id="rId300">
-        <w:r>
-          <w:rPr/>
-          <w:t xml:space="preserve">https://doi.org/10.1038/nbt.1665</w:t>
-        </w:r>
-      </w:hyperlink>
+      <w:r>
+        <w:rPr/>
+        <w:t xml:space="preserve">https://doi.org/10.1038/nbt.1665</w:t>
+      </w:r>
     </w:p>
     <w:bookmarkEnd w:id="301"/>
     <w:bookmarkStart w:id="303" w:name="ref-johnson2007"/>
@@ -33316,12 +33250,10 @@
       <w:r>
         <w:t xml:space="preserve"> </w:t>
       </w:r>
-      <w:hyperlink r:id="rId302">
-        <w:r>
-          <w:rPr/>
-          <w:t xml:space="preserve">https://doi.org/10.1093/biostatistics/kxj037</w:t>
-        </w:r>
-      </w:hyperlink>
+      <w:r>
+        <w:rPr/>
+        <w:t xml:space="preserve">https://doi.org/10.1093/biostatistics/kxj037</w:t>
+      </w:r>
     </w:p>
     <w:bookmarkEnd w:id="303"/>
     <w:bookmarkStart w:id="305" w:name="ref-leek2010"/>
@@ -33344,12 +33276,10 @@
       <w:r>
         <w:t xml:space="preserve"> </w:t>
       </w:r>
-      <w:hyperlink r:id="rId304">
-        <w:r>
-          <w:rPr/>
-          <w:t xml:space="preserve">https://doi.org/10.1038/nrg2825</w:t>
-        </w:r>
-      </w:hyperlink>
+      <w:r>
+        <w:rPr/>
+        <w:t xml:space="preserve">https://doi.org/10.1038/nrg2825</w:t>
+      </w:r>
     </w:p>
     <w:bookmarkEnd w:id="305"/>
     <w:bookmarkStart w:id="307" w:name="ref-saal2015"/>
@@ -33429,12 +33359,10 @@
       <w:r>
         <w:t xml:space="preserve"> </w:t>
       </w:r>
-      <w:hyperlink r:id="rId306">
-        <w:r>
-          <w:rPr/>
-          <w:t xml:space="preserve">https://doi.org/10.1186/s13073-015-0131-9</w:t>
-        </w:r>
-      </w:hyperlink>
+      <w:r>
+        <w:rPr/>
+        <w:t xml:space="preserve">https://doi.org/10.1186/s13073-015-0131-9</w:t>
+      </w:r>
     </w:p>
     <w:bookmarkEnd w:id="307"/>
     <w:bookmarkStart w:id="309" w:name="ref-brueffer2018"/>
@@ -33469,12 +33397,10 @@
       <w:r>
         <w:t xml:space="preserve"> </w:t>
       </w:r>
-      <w:hyperlink r:id="rId308">
-        <w:r>
-          <w:rPr/>
-          <w:t xml:space="preserve">https://doi.org/10.1200/PO.17.00135</w:t>
-        </w:r>
-      </w:hyperlink>
+      <w:r>
+        <w:rPr/>
+        <w:t xml:space="preserve">https://doi.org/10.1200/PO.17.00135</w:t>
+      </w:r>
     </w:p>
     <w:bookmarkEnd w:id="309"/>
     <w:bookmarkStart w:id="311" w:name="ref-tcga2012"/>
@@ -33497,12 +33423,10 @@
       <w:r>
         <w:t xml:space="preserve"> </w:t>
       </w:r>
-      <w:hyperlink r:id="rId310">
-        <w:r>
-          <w:rPr/>
-          <w:t xml:space="preserve">https://doi.org/10.1038/nature11412</w:t>
-        </w:r>
-      </w:hyperlink>
+      <w:r>
+        <w:rPr/>
+        <w:t xml:space="preserve">https://doi.org/10.1038/nature11412</w:t>
+      </w:r>
     </w:p>
     <w:bookmarkEnd w:id="311"/>
     <w:bookmarkStart w:id="313" w:name="ref-kao2011"/>
@@ -33525,12 +33449,10 @@
       <w:r>
         <w:t xml:space="preserve"> </w:t>
       </w:r>
-      <w:hyperlink r:id="rId312">
-        <w:r>
-          <w:rPr/>
-          <w:t xml:space="preserve">https://doi.org/10.1186/1471-2407-11-143</w:t>
-        </w:r>
-      </w:hyperlink>
+      <w:r>
+        <w:rPr/>
+        <w:t xml:space="preserve">https://doi.org/10.1186/1471-2407-11-143</w:t>
+      </w:r>
     </w:p>
     <w:bookmarkEnd w:id="313"/>
     <w:bookmarkStart w:id="315" w:name="ref-pawitan2005"/>
@@ -33553,12 +33475,10 @@
       <w:r>
         <w:t xml:space="preserve"> </w:t>
       </w:r>
-      <w:hyperlink r:id="rId314">
-        <w:r>
-          <w:rPr/>
-          <w:t xml:space="preserve">https://doi.org/10.1186/bcr1325</w:t>
-        </w:r>
-      </w:hyperlink>
+      <w:r>
+        <w:rPr/>
+        <w:t xml:space="preserve">https://doi.org/10.1186/bcr1325</w:t>
+      </w:r>
     </w:p>
     <w:bookmarkEnd w:id="315"/>
     <w:bookmarkStart w:id="317" w:name="ref-hatzis2011"/>
@@ -33581,12 +33501,10 @@
       <w:r>
         <w:t xml:space="preserve"> </w:t>
       </w:r>
-      <w:hyperlink r:id="rId316">
-        <w:r>
-          <w:rPr/>
-          <w:t xml:space="preserve">https://doi.org/10.1001/jama.2011.593</w:t>
-        </w:r>
-      </w:hyperlink>
+      <w:r>
+        <w:rPr/>
+        <w:t xml:space="preserve">https://doi.org/10.1001/jama.2011.593</w:t>
+      </w:r>
     </w:p>
     <w:bookmarkEnd w:id="317"/>
     <w:bookmarkStart w:id="319" w:name="ref-miyake2012"/>
@@ -33630,12 +33548,10 @@
       <w:r>
         <w:t xml:space="preserve"> </w:t>
       </w:r>
-      <w:hyperlink r:id="rId318">
-        <w:r>
-          <w:rPr/>
-          <w:t xml:space="preserve">https://doi.org/10.1111/j.1349-7006.2012.02241.x</w:t>
-        </w:r>
-      </w:hyperlink>
+      <w:r>
+        <w:rPr/>
+        <w:t xml:space="preserve">https://doi.org/10.1111/j.1349-7006.2012.02241.x</w:t>
+      </w:r>
     </w:p>
     <w:bookmarkEnd w:id="319"/>
     <w:bookmarkStart w:id="321" w:name="ref-esserman2012"/>
@@ -33703,12 +33619,10 @@
       <w:r>
         <w:t xml:space="preserve"> </w:t>
       </w:r>
-      <w:hyperlink r:id="rId320">
-        <w:r>
-          <w:rPr/>
-          <w:t xml:space="preserve">https://doi.org/10.1007/s10549-011-1895-2</w:t>
-        </w:r>
-      </w:hyperlink>
+      <w:r>
+        <w:rPr/>
+        <w:t xml:space="preserve">https://doi.org/10.1007/s10549-011-1895-2</w:t>
+      </w:r>
     </w:p>
     <w:bookmarkEnd w:id="321"/>
     <w:bookmarkStart w:id="323" w:name="ref-wolf2022"/>
@@ -33731,12 +33645,10 @@
       <w:r>
         <w:t xml:space="preserve"> </w:t>
       </w:r>
-      <w:hyperlink r:id="rId322">
-        <w:r>
-          <w:rPr/>
-          <w:t xml:space="preserve">https://doi.org/10.1016/j.ccell.2022.05.005</w:t>
-        </w:r>
-      </w:hyperlink>
+      <w:r>
+        <w:rPr/>
+        <w:t xml:space="preserve">https://doi.org/10.1016/j.ccell.2022.05.005</w:t>
+      </w:r>
     </w:p>
     <w:bookmarkEnd w:id="323"/>
     <w:bookmarkStart w:id="325" w:name="ref-moons2015"/>
@@ -33765,12 +33677,10 @@
       <w:r>
         <w:t xml:space="preserve"> </w:t>
       </w:r>
-      <w:hyperlink r:id="rId324">
-        <w:r>
-          <w:rPr/>
-          <w:t xml:space="preserve">https://doi.org/10.7326/M14-0698</w:t>
-        </w:r>
-      </w:hyperlink>
+      <w:r>
+        <w:rPr/>
+        <w:t xml:space="preserve">https://doi.org/10.7326/M14-0698</w:t>
+      </w:r>
     </w:p>
     <w:bookmarkEnd w:id="325"/>
     <w:bookmarkStart w:id="327" w:name="ref-collins2015"/>
@@ -33811,12 +33721,10 @@
       <w:r>
         <w:t xml:space="preserve"> </w:t>
       </w:r>
-      <w:hyperlink r:id="rId326">
-        <w:r>
-          <w:rPr/>
-          <w:t xml:space="preserve">https://doi.org/10.1136/bmj.g7594</w:t>
-        </w:r>
-      </w:hyperlink>
+      <w:r>
+        <w:rPr/>
+        <w:t xml:space="preserve">https://doi.org/10.1136/bmj.g7594</w:t>
+      </w:r>
     </w:p>
     <w:bookmarkEnd w:id="327"/>
     <w:bookmarkStart w:id="329" w:name="ref-royston2013"/>
@@ -33848,12 +33756,10 @@
       <w:r>
         <w:t xml:space="preserve"> </w:t>
       </w:r>
-      <w:hyperlink r:id="rId328">
-        <w:r>
-          <w:rPr/>
-          <w:t xml:space="preserve">https://doi.org/10.1186/1471-2288-13-33</w:t>
-        </w:r>
-      </w:hyperlink>
+      <w:r>
+        <w:rPr/>
+        <w:t xml:space="preserve">https://doi.org/10.1186/1471-2288-13-33</w:t>
+      </w:r>
     </w:p>
     <w:bookmarkEnd w:id="329"/>
     <w:bookmarkStart w:id="331" w:name="ref-steyerberg2016"/>
@@ -33876,12 +33782,10 @@
       <w:r>
         <w:t xml:space="preserve"> </w:t>
       </w:r>
-      <w:hyperlink r:id="rId330">
-        <w:r>
-          <w:rPr/>
-          <w:t xml:space="preserve">https://doi.org/10.1016/j.jclinepi.2015.04.005</w:t>
-        </w:r>
-      </w:hyperlink>
+      <w:r>
+        <w:rPr/>
+        <w:t xml:space="preserve">https://doi.org/10.1016/j.jclinepi.2015.04.005</w:t>
+      </w:r>
     </w:p>
     <w:bookmarkEnd w:id="331"/>
     <w:bookmarkStart w:id="333" w:name="ref-robinson2010"/>
@@ -33919,12 +33823,10 @@
       <w:r>
         <w:t xml:space="preserve"> </w:t>
       </w:r>
-      <w:hyperlink r:id="rId332">
-        <w:r>
-          <w:rPr/>
-          <w:t xml:space="preserve">https://doi.org/10.1093/bioinformatics/btp616</w:t>
-        </w:r>
-      </w:hyperlink>
+      <w:r>
+        <w:rPr/>
+        <w:t xml:space="preserve">https://doi.org/10.1093/bioinformatics/btp616</w:t>
+      </w:r>
     </w:p>
     <w:bookmarkEnd w:id="333"/>
     <w:bookmarkStart w:id="335" w:name="ref-robinson2010b"/>
@@ -33956,12 +33858,10 @@
       <w:r>
         <w:t xml:space="preserve"> </w:t>
       </w:r>
-      <w:hyperlink r:id="rId334">
-        <w:r>
-          <w:rPr/>
-          <w:t xml:space="preserve">https://doi.org/10.1186/gb-2010-11-3-r25</w:t>
-        </w:r>
-      </w:hyperlink>
+      <w:r>
+        <w:rPr/>
+        <w:t xml:space="preserve">https://doi.org/10.1186/gb-2010-11-3-r25</w:t>
+      </w:r>
     </w:p>
     <w:bookmarkEnd w:id="335"/>
     <w:bookmarkStart w:id="337" w:name="ref-zou2005"/>
@@ -33984,12 +33884,10 @@
       <w:r>
         <w:t xml:space="preserve"> </w:t>
       </w:r>
-      <w:hyperlink r:id="rId336">
-        <w:r>
-          <w:rPr/>
-          <w:t xml:space="preserve">https://doi.org/10.1111/j.1467-9868.2005.00503.x</w:t>
-        </w:r>
-      </w:hyperlink>
+      <w:r>
+        <w:rPr/>
+        <w:t xml:space="preserve">https://doi.org/10.1111/j.1467-9868.2005.00503.x</w:t>
+      </w:r>
     </w:p>
     <w:bookmarkEnd w:id="337"/>
     <w:bookmarkStart w:id="339" w:name="ref-tibshirani1996"/>
@@ -34012,12 +33910,10 @@
       <w:r>
         <w:t xml:space="preserve"> </w:t>
       </w:r>
-      <w:hyperlink r:id="rId338">
-        <w:r>
-          <w:rPr/>
-          <w:t xml:space="preserve">https://doi.org/10.1111/j.2517-6161.1996.tb02080.x</w:t>
-        </w:r>
-      </w:hyperlink>
+      <w:r>
+        <w:rPr/>
+        <w:t xml:space="preserve">https://doi.org/10.1111/j.2517-6161.1996.tb02080.x</w:t>
+      </w:r>
     </w:p>
     <w:bookmarkEnd w:id="339"/>
     <w:bookmarkStart w:id="341" w:name="ref-tibshirani1997"/>
@@ -34049,12 +33945,10 @@
       <w:r>
         <w:t xml:space="preserve"> </w:t>
       </w:r>
-      <w:hyperlink r:id="rId340">
-        <w:r>
-          <w:rPr/>
-          <w:t xml:space="preserve">https://doi.org/10.1002/(SICI)1097-0258(19970228)16:4&lt;385::AID-SIM380&gt;3.0.CO;2-3</w:t>
-        </w:r>
-      </w:hyperlink>
+      <w:r>
+        <w:rPr/>
+        <w:t xml:space="preserve">https://doi.org/10.1002/(SICI)1097-0258(19970228)16:4&lt;385::AID-SIM380&gt;3.0.CO;2-3</w:t>
+      </w:r>
     </w:p>
     <w:bookmarkEnd w:id="341"/>
     <w:bookmarkStart w:id="343" w:name="ref-friedman2010"/>
@@ -34077,12 +33971,10 @@
       <w:r>
         <w:t xml:space="preserve"> </w:t>
       </w:r>
-      <w:hyperlink r:id="rId342">
-        <w:r>
-          <w:rPr/>
-          <w:t xml:space="preserve">https://doi.org/10.18637/jss.v033.i01</w:t>
-        </w:r>
-      </w:hyperlink>
+      <w:r>
+        <w:rPr/>
+        <w:t xml:space="preserve">https://doi.org/10.18637/jss.v033.i01</w:t>
+      </w:r>
     </w:p>
     <w:bookmarkEnd w:id="343"/>
     <w:bookmarkStart w:id="345" w:name="ref-simon2011"/>
@@ -34114,12 +34006,10 @@
       <w:r>
         <w:t xml:space="preserve"> </w:t>
       </w:r>
-      <w:hyperlink r:id="rId344">
-        <w:r>
-          <w:rPr/>
-          <w:t xml:space="preserve">https://doi.org/10.18637/jss.v039.i05</w:t>
-        </w:r>
-      </w:hyperlink>
+      <w:r>
+        <w:rPr/>
+        <w:t xml:space="preserve">https://doi.org/10.18637/jss.v039.i05</w:t>
+      </w:r>
     </w:p>
     <w:bookmarkEnd w:id="345"/>
     <w:bookmarkStart w:id="347" w:name="ref-grambsch1994"/>
@@ -34142,12 +34032,10 @@
       <w:r>
         <w:t xml:space="preserve"> </w:t>
       </w:r>
-      <w:hyperlink r:id="rId346">
-        <w:r>
-          <w:rPr/>
-          <w:t xml:space="preserve">https://doi.org/10.1093/biomet/81.3.515</w:t>
-        </w:r>
-      </w:hyperlink>
+      <w:r>
+        <w:rPr/>
+        <w:t xml:space="preserve">https://doi.org/10.1093/biomet/81.3.515</w:t>
+      </w:r>
     </w:p>
     <w:bookmarkEnd w:id="347"/>
     <w:bookmarkStart w:id="349" w:name="ref-therneau2000"/>
@@ -34179,12 +34067,10 @@
       <w:r>
         <w:t xml:space="preserve"> </w:t>
       </w:r>
-      <w:hyperlink r:id="rId348">
-        <w:r>
-          <w:rPr/>
-          <w:t xml:space="preserve">https://doi.org/10.1007/978-1-4757-3294-8</w:t>
-        </w:r>
-      </w:hyperlink>
+      <w:r>
+        <w:rPr/>
+        <w:t xml:space="preserve">https://doi.org/10.1007/978-1-4757-3294-8</w:t>
+      </w:r>
     </w:p>
     <w:bookmarkEnd w:id="349"/>
     <w:bookmarkStart w:id="351" w:name="ref-harrell1982"/>
@@ -34207,12 +34093,10 @@
       <w:r>
         <w:t xml:space="preserve"> </w:t>
       </w:r>
-      <w:hyperlink r:id="rId350">
-        <w:r>
-          <w:rPr/>
-          <w:t xml:space="preserve">https://doi.org/10.1001/jama.1982.03320430047030</w:t>
-        </w:r>
-      </w:hyperlink>
+      <w:r>
+        <w:rPr/>
+        <w:t xml:space="preserve">https://doi.org/10.1001/jama.1982.03320430047030</w:t>
+      </w:r>
     </w:p>
     <w:bookmarkEnd w:id="351"/>
     <w:bookmarkStart w:id="353" w:name="ref-efron1979"/>
@@ -34235,12 +34119,10 @@
       <w:r>
         <w:t xml:space="preserve"> </w:t>
       </w:r>
-      <w:hyperlink r:id="rId352">
-        <w:r>
-          <w:rPr/>
-          <w:t xml:space="preserve">https://doi.org/10.1214/aos/1176344552</w:t>
-        </w:r>
-      </w:hyperlink>
+      <w:r>
+        <w:rPr/>
+        <w:t xml:space="preserve">https://doi.org/10.1214/aos/1176344552</w:t>
+      </w:r>
     </w:p>
     <w:bookmarkEnd w:id="353"/>
     <w:bookmarkStart w:id="355" w:name="ref-uno2011"/>
@@ -34272,12 +34154,10 @@
       <w:r>
         <w:t xml:space="preserve"> </w:t>
       </w:r>
-      <w:hyperlink r:id="rId354">
-        <w:r>
-          <w:rPr/>
-          <w:t xml:space="preserve">https://doi.org/10.1002/sim.4154</w:t>
-        </w:r>
-      </w:hyperlink>
+      <w:r>
+        <w:rPr/>
+        <w:t xml:space="preserve">https://doi.org/10.1002/sim.4154</w:t>
+      </w:r>
     </w:p>
     <w:bookmarkEnd w:id="355"/>
     <w:bookmarkStart w:id="357" w:name="ref-blanche2013"/>
@@ -34300,12 +34180,10 @@
       <w:r>
         <w:t xml:space="preserve"> </w:t>
       </w:r>
-      <w:hyperlink r:id="rId356">
-        <w:r>
-          <w:rPr/>
-          <w:t xml:space="preserve">https://doi.org/10.1002/sim.5958</w:t>
-        </w:r>
-      </w:hyperlink>
+      <w:r>
+        <w:rPr/>
+        <w:t xml:space="preserve">https://doi.org/10.1002/sim.5958</w:t>
+      </w:r>
     </w:p>
     <w:bookmarkEnd w:id="357"/>
     <w:bookmarkStart w:id="359" w:name="ref-fine1999"/>
@@ -34328,12 +34206,10 @@
       <w:r>
         <w:t xml:space="preserve"> </w:t>
       </w:r>
-      <w:hyperlink r:id="rId358">
-        <w:r>
-          <w:rPr/>
-          <w:t xml:space="preserve">https://doi.org/10.1080/01621459.1999.10474144</w:t>
-        </w:r>
-      </w:hyperlink>
+      <w:r>
+        <w:rPr/>
+        <w:t xml:space="preserve">https://doi.org/10.1080/01621459.1999.10474144</w:t>
+      </w:r>
     </w:p>
     <w:bookmarkEnd w:id="359"/>
     <w:bookmarkStart w:id="361" w:name="ref-vancalster2016"/>
@@ -34356,12 +34232,10 @@
       <w:r>
         <w:t xml:space="preserve"> </w:t>
       </w:r>
-      <w:hyperlink r:id="rId360">
-        <w:r>
-          <w:rPr/>
-          <w:t xml:space="preserve">https://doi.org/10.1016/j.jclinepi.2015.12.005</w:t>
-        </w:r>
-      </w:hyperlink>
+      <w:r>
+        <w:rPr/>
+        <w:t xml:space="preserve">https://doi.org/10.1016/j.jclinepi.2015.12.005</w:t>
+      </w:r>
     </w:p>
     <w:bookmarkEnd w:id="361"/>
     <w:bookmarkStart w:id="363" w:name="ref-vancalster2019"/>
@@ -34393,12 +34267,10 @@
       <w:r>
         <w:t xml:space="preserve"> </w:t>
       </w:r>
-      <w:hyperlink r:id="rId362">
-        <w:r>
-          <w:rPr/>
-          <w:t xml:space="preserve">https://doi.org/10.1186/s12916-019-1466-7</w:t>
-        </w:r>
-      </w:hyperlink>
+      <w:r>
+        <w:rPr/>
+        <w:t xml:space="preserve">https://doi.org/10.1186/s12916-019-1466-7</w:t>
+      </w:r>
     </w:p>
     <w:bookmarkEnd w:id="363"/>
     <w:bookmarkStart w:id="365" w:name="ref-vickers2006"/>
@@ -34421,12 +34293,10 @@
       <w:r>
         <w:t xml:space="preserve"> </w:t>
       </w:r>
-      <w:hyperlink r:id="rId364">
-        <w:r>
-          <w:rPr/>
-          <w:t xml:space="preserve">https://doi.org/10.1177/0272989X06295361</w:t>
-        </w:r>
-      </w:hyperlink>
+      <w:r>
+        <w:rPr/>
+        <w:t xml:space="preserve">https://doi.org/10.1177/0272989X06295361</w:t>
+      </w:r>
     </w:p>
     <w:bookmarkEnd w:id="365"/>
     <w:bookmarkStart w:id="367" w:name="ref-viechtbauer2010"/>
@@ -34461,12 +34331,10 @@
       <w:r>
         <w:t xml:space="preserve"> </w:t>
       </w:r>
-      <w:hyperlink r:id="rId366">
-        <w:r>
-          <w:rPr/>
-          <w:t xml:space="preserve">https://doi.org/10.18637/jss.v036.i03</w:t>
-        </w:r>
-      </w:hyperlink>
+      <w:r>
+        <w:rPr/>
+        <w:t xml:space="preserve">https://doi.org/10.18637/jss.v036.i03</w:t>
+      </w:r>
     </w:p>
     <w:bookmarkEnd w:id="367"/>
     <w:bookmarkStart w:id="369" w:name="ref-higgins2003"/>
@@ -34489,12 +34357,10 @@
       <w:r>
         <w:t xml:space="preserve"> </w:t>
       </w:r>
-      <w:hyperlink r:id="rId368">
-        <w:r>
-          <w:rPr/>
-          <w:t xml:space="preserve">https://doi.org/10.1136/bmj.327.7414.557</w:t>
-        </w:r>
-      </w:hyperlink>
+      <w:r>
+        <w:rPr/>
+        <w:t xml:space="preserve">https://doi.org/10.1136/bmj.327.7414.557</w:t>
+      </w:r>
     </w:p>
     <w:bookmarkEnd w:id="369"/>
     <w:bookmarkStart w:id="371" w:name="ref-hartung2001"/>
@@ -34517,12 +34383,10 @@
       <w:r>
         <w:t xml:space="preserve"> </w:t>
       </w:r>
-      <w:hyperlink r:id="rId370">
-        <w:r>
-          <w:rPr/>
-          <w:t xml:space="preserve">https://doi.org/10.1002/sim.1009</w:t>
-        </w:r>
-      </w:hyperlink>
+      <w:r>
+        <w:rPr/>
+        <w:t xml:space="preserve">https://doi.org/10.1002/sim.1009</w:t>
+      </w:r>
     </w:p>
     <w:bookmarkEnd w:id="371"/>
     <w:bookmarkStart w:id="373" w:name="ref-dersimonian1986"/>
@@ -34545,12 +34409,10 @@
       <w:r>
         <w:t xml:space="preserve"> </w:t>
       </w:r>
-      <w:hyperlink r:id="rId372">
-        <w:r>
-          <w:rPr/>
-          <w:t xml:space="preserve">https://doi.org/10.1016/0197-2456(86)90046-2</w:t>
-        </w:r>
-      </w:hyperlink>
+      <w:r>
+        <w:rPr/>
+        <w:t xml:space="preserve">https://doi.org/10.1016/0197-2456(86)90046-2</w:t>
+      </w:r>
     </w:p>
     <w:bookmarkEnd w:id="373"/>
     <w:bookmarkStart w:id="375" w:name="ref-gendoo2016"/>
@@ -34588,12 +34450,10 @@
       <w:r>
         <w:t xml:space="preserve"> </w:t>
       </w:r>
-      <w:hyperlink r:id="rId374">
-        <w:r>
-          <w:rPr/>
-          <w:t xml:space="preserve">https://doi.org/10.1093/bioinformatics/btv693</w:t>
-        </w:r>
-      </w:hyperlink>
+      <w:r>
+        <w:rPr/>
+        <w:t xml:space="preserve">https://doi.org/10.1093/bioinformatics/btv693</w:t>
+      </w:r>
     </w:p>
     <w:bookmarkEnd w:id="375"/>
     <w:bookmarkStart w:id="377" w:name="ref-cheang2009"/>
@@ -34652,12 +34512,10 @@
       <w:r>
         <w:t xml:space="preserve"> </w:t>
       </w:r>
-      <w:hyperlink r:id="rId376">
-        <w:r>
-          <w:rPr/>
-          <w:t xml:space="preserve">https://doi.org/10.1093/jnci/djp082</w:t>
-        </w:r>
-      </w:hyperlink>
+      <w:r>
+        <w:rPr/>
+        <w:t xml:space="preserve">https://doi.org/10.1093/jnci/djp082</w:t>
+      </w:r>
     </w:p>
     <w:bookmarkEnd w:id="377"/>
     <w:bookmarkStart w:id="379" w:name="ref-denkert2018"/>
@@ -34680,12 +34538,10 @@
       <w:r>
         <w:t xml:space="preserve"> </w:t>
       </w:r>
-      <w:hyperlink r:id="rId378">
-        <w:r>
-          <w:rPr/>
-          <w:t xml:space="preserve">https://doi.org/10.1016/S1470-2045(17)30904-X</w:t>
-        </w:r>
-      </w:hyperlink>
+      <w:r>
+        <w:rPr/>
+        <w:t xml:space="preserve">https://doi.org/10.1016/S1470-2045(17)30904-X</w:t>
+      </w:r>
     </w:p>
     <w:bookmarkEnd w:id="379"/>
     <w:bookmarkStart w:id="381" w:name="ref-cortazar2014"/>
@@ -34720,12 +34576,10 @@
       <w:r>
         <w:t xml:space="preserve"> </w:t>
       </w:r>
-      <w:hyperlink r:id="rId380">
-        <w:r>
-          <w:rPr/>
-          <w:t xml:space="preserve">https://doi.org/10.1016/S0140-6736(13)62422-8</w:t>
-        </w:r>
-      </w:hyperlink>
+      <w:r>
+        <w:rPr/>
+        <w:t xml:space="preserve">https://doi.org/10.1016/S0140-6736(13)62422-8</w:t>
+      </w:r>
     </w:p>
     <w:bookmarkEnd w:id="381"/>
     <w:bookmarkStart w:id="383" w:name="ref-prat2015"/>
@@ -34748,12 +34602,10 @@
       <w:r>
         <w:t xml:space="preserve"> </w:t>
       </w:r>
-      <w:hyperlink r:id="rId382">
-        <w:r>
-          <w:rPr/>
-          <w:t xml:space="preserve">https://doi.org/10.1186/s12916-015-0540-z</w:t>
-        </w:r>
-      </w:hyperlink>
+      <w:r>
+        <w:rPr/>
+        <w:t xml:space="preserve">https://doi.org/10.1186/s12916-015-0540-z</w:t>
+      </w:r>
     </w:p>
     <w:bookmarkEnd w:id="383"/>
     <w:bookmarkStart w:id="385" w:name="ref-botan2026"/>
@@ -34794,12 +34646,10 @@
       <w:r>
         <w:t xml:space="preserve"> </w:t>
       </w:r>
-      <w:hyperlink r:id="rId384">
-        <w:r>
-          <w:rPr/>
-          <w:t xml:space="preserve">https://doi.org/10.1186/s13058-026-02298-5</w:t>
-        </w:r>
-      </w:hyperlink>
+      <w:r>
+        <w:rPr/>
+        <w:t xml:space="preserve">https://doi.org/10.1186/s13058-026-02298-5</w:t>
+      </w:r>
     </w:p>
     <w:bookmarkEnd w:id="385"/>
     <w:bookmarkEnd w:id="386"/>

</xml_diff>